<commit_message>
growth curves for Pputida: Fig S6d
</commit_message>
<xml_diff>
--- a/writing/supplement--15Dec25_revision.docx
+++ b/writing/supplement--15Dec25_revision.docx
@@ -720,7 +720,37 @@
                 <w:lang w:eastAsia="en-GB"/>
                 <w14:ligatures w14:val="none"/>
               </w:rPr>
-              <w:t>Pseudomonas putida  KT2440</w:t>
+              <w:t xml:space="preserve">Pseudomonas </w:t>
+            </w:r>
+            <w:proofErr w:type="gramStart"/>
+            <w:r>
+              <w:rPr>
+                <w:rFonts w:ascii="Calibri" w:eastAsia="Times New Roman" w:hAnsi="Calibri" w:cs="Calibri"/>
+                <w:i/>
+                <w:iCs/>
+                <w:color w:val="000000"/>
+                <w:kern w:val="0"/>
+                <w:sz w:val="22"/>
+                <w:szCs w:val="22"/>
+                <w:lang w:eastAsia="en-GB"/>
+                <w14:ligatures w14:val="none"/>
+              </w:rPr>
+              <w:t>putida  KT</w:t>
+            </w:r>
+            <w:proofErr w:type="gramEnd"/>
+            <w:r>
+              <w:rPr>
+                <w:rFonts w:ascii="Calibri" w:eastAsia="Times New Roman" w:hAnsi="Calibri" w:cs="Calibri"/>
+                <w:i/>
+                <w:iCs/>
+                <w:color w:val="000000"/>
+                <w:kern w:val="0"/>
+                <w:sz w:val="22"/>
+                <w:szCs w:val="22"/>
+                <w:lang w:eastAsia="en-GB"/>
+                <w14:ligatures w14:val="none"/>
+              </w:rPr>
+              <w:t>2440</w:t>
             </w:r>
           </w:p>
         </w:tc>
@@ -2844,7 +2874,37 @@
                 <w:lang w:eastAsia="en-GB"/>
                 <w14:ligatures w14:val="none"/>
               </w:rPr>
-              <w:t>Pseudomonas putida  KT2440</w:t>
+              <w:t xml:space="preserve">Pseudomonas </w:t>
+            </w:r>
+            <w:proofErr w:type="gramStart"/>
+            <w:r>
+              <w:rPr>
+                <w:rFonts w:ascii="Calibri" w:eastAsia="Times New Roman" w:hAnsi="Calibri" w:cs="Calibri"/>
+                <w:i/>
+                <w:iCs/>
+                <w:color w:val="000000"/>
+                <w:kern w:val="0"/>
+                <w:sz w:val="22"/>
+                <w:szCs w:val="22"/>
+                <w:lang w:eastAsia="en-GB"/>
+                <w14:ligatures w14:val="none"/>
+              </w:rPr>
+              <w:t>putida  KT</w:t>
+            </w:r>
+            <w:proofErr w:type="gramEnd"/>
+            <w:r>
+              <w:rPr>
+                <w:rFonts w:ascii="Calibri" w:eastAsia="Times New Roman" w:hAnsi="Calibri" w:cs="Calibri"/>
+                <w:i/>
+                <w:iCs/>
+                <w:color w:val="000000"/>
+                <w:kern w:val="0"/>
+                <w:sz w:val="22"/>
+                <w:szCs w:val="22"/>
+                <w:lang w:eastAsia="en-GB"/>
+                <w14:ligatures w14:val="none"/>
+              </w:rPr>
+              <w:t>2440</w:t>
             </w:r>
           </w:p>
         </w:tc>
@@ -5055,7 +5115,23 @@
           <w:rFonts w:ascii="Times New Roman" w:hAnsi="Times New Roman" w:cs="Times New Roman"/>
           <w:lang w:val="en-US"/>
         </w:rPr>
-        <w:t xml:space="preserve"> cultures in 96-well microplates covered with a Breathe-Easy sealing membrane </w:t>
+        <w:t xml:space="preserve"> cultures in 96-well microplates covered with a </w:t>
+      </w:r>
+      <w:proofErr w:type="gramStart"/>
+      <w:r>
+        <w:rPr>
+          <w:rFonts w:ascii="Times New Roman" w:hAnsi="Times New Roman" w:cs="Times New Roman"/>
+          <w:lang w:val="en-US"/>
+        </w:rPr>
+        <w:t>Breathe</w:t>
+      </w:r>
+      <w:proofErr w:type="gramEnd"/>
+      <w:r>
+        <w:rPr>
+          <w:rFonts w:ascii="Times New Roman" w:hAnsi="Times New Roman" w:cs="Times New Roman"/>
+          <w:lang w:val="en-US"/>
+        </w:rPr>
+        <w:t xml:space="preserve">-Easy sealing membrane </w:t>
       </w:r>
       <w:r>
         <w:rPr>
@@ -5338,7 +5414,23 @@
           <w:rFonts w:ascii="Times New Roman" w:hAnsi="Times New Roman" w:cs="Times New Roman"/>
           <w:lang w:val="en-US"/>
         </w:rPr>
-        <w:t xml:space="preserve"> PES filter, and plated on agar plates to verify the absence of live bacteria. This supernatant was mixed with fresh media and aliquoted to 96-well microplates so that each focal species could be subjected to 90%, 80%, 70%, 60%, 50%, 40%, 30%, 20%, 10%, 5%, and 0% of each supernatant. Microplates were incubated in the plate reader for 12 </w:t>
+        <w:t xml:space="preserve"> PES filter, and plated on agar plates to verify the absence of live bacteria. This supernatant was mixed with fresh media and aliquoted to 96-well microplates so that each focal species could be subjected to 90%, 80%, 70%, 60%, </w:t>
+      </w:r>
+      <w:proofErr w:type="gramStart"/>
+      <w:r>
+        <w:rPr>
+          <w:rFonts w:ascii="Times New Roman" w:hAnsi="Times New Roman" w:cs="Times New Roman"/>
+          <w:lang w:val="en-US"/>
+        </w:rPr>
+        <w:t>50%, 40</w:t>
+      </w:r>
+      <w:proofErr w:type="gramEnd"/>
+      <w:r>
+        <w:rPr>
+          <w:rFonts w:ascii="Times New Roman" w:hAnsi="Times New Roman" w:cs="Times New Roman"/>
+          <w:lang w:val="en-US"/>
+        </w:rPr>
+        <w:t xml:space="preserve">%, 30%, 20%, 10%, 5%, and 0% of each supernatant. Microplates were incubated in the plate reader for 12 </w:t>
       </w:r>
       <w:proofErr w:type="spellStart"/>
       <w:r>
@@ -5437,6 +5529,7 @@
         <w:t xml:space="preserve"> function (</w:t>
       </w:r>
       <w:proofErr w:type="spellStart"/>
+      <w:proofErr w:type="gramStart"/>
       <w:r>
         <w:rPr>
           <w:rFonts w:ascii="Times New Roman" w:hAnsi="Times New Roman" w:cs="Times New Roman"/>
@@ -5445,6 +5538,7 @@
         <w:t>minpack.lm</w:t>
       </w:r>
       <w:proofErr w:type="spellEnd"/>
+      <w:proofErr w:type="gramEnd"/>
       <w:r>
         <w:rPr>
           <w:rFonts w:ascii="Times New Roman" w:hAnsi="Times New Roman" w:cs="Times New Roman"/>
@@ -5889,7 +5983,23 @@
           <w:rFonts w:ascii="Times New Roman" w:hAnsi="Times New Roman" w:cs="Times New Roman"/>
           <w:lang w:val="en-US"/>
         </w:rPr>
-        <w:t>, or excluded from further analyses. For panels B-E), representative screenshots are taken from the FCS Express analysis for a positive sample (top plots) with all four species present and a negative sample (bottom plots) with the three other species present.</w:t>
+        <w:t xml:space="preserve">, or excluded from further analyses. For panels B-E), representative screenshots are taken from the FCS Express analysis for a positive sample (top plots) with all four species present and a negative sample (bottom plots) with the three other species </w:t>
+      </w:r>
+      <w:proofErr w:type="gramStart"/>
+      <w:r>
+        <w:rPr>
+          <w:rFonts w:ascii="Times New Roman" w:hAnsi="Times New Roman" w:cs="Times New Roman"/>
+          <w:lang w:val="en-US"/>
+        </w:rPr>
+        <w:t>present</w:t>
+      </w:r>
+      <w:proofErr w:type="gramEnd"/>
+      <w:r>
+        <w:rPr>
+          <w:rFonts w:ascii="Times New Roman" w:hAnsi="Times New Roman" w:cs="Times New Roman"/>
+          <w:lang w:val="en-US"/>
+        </w:rPr>
+        <w:t>.</w:t>
       </w:r>
     </w:p>
     <w:p>
@@ -6783,14 +6893,12 @@
                               </w:rPr>
                               <w:t xml:space="preserve">Gating strategy to identify the </w:t>
                             </w:r>
-                            <w:proofErr w:type="spellStart"/>
                             <w:r>
                               <w:rPr>
                                 <w:lang w:val="en-US"/>
                               </w:rPr>
                               <w:t>mTourquoise</w:t>
                             </w:r>
-                            <w:proofErr w:type="spellEnd"/>
                             <w:r>
                               <w:rPr>
                                 <w:lang w:val="en-US"/>
@@ -6803,16 +6911,7 @@
                                 <w:iCs/>
                                 <w:lang w:val="en-US"/>
                               </w:rPr>
-                              <w:t xml:space="preserve">P. </w:t>
-                            </w:r>
-                            <w:proofErr w:type="spellStart"/>
-                            <w:r>
-                              <w:rPr>
-                                <w:i/>
-                                <w:iCs/>
-                                <w:lang w:val="en-US"/>
-                              </w:rPr>
-                              <w:t>p</w:t>
+                              <w:t>P. p</w:t>
                             </w:r>
                             <w:r>
                               <w:rPr>
@@ -6822,7 +6921,6 @@
                               </w:rPr>
                               <w:t>rotegens</w:t>
                             </w:r>
-                            <w:proofErr w:type="spellEnd"/>
                             <w:r>
                               <w:rPr>
                                 <w:i/>
@@ -7049,7 +7147,6 @@
                               </w:rPr>
                               <w:t xml:space="preserve">P. </w:t>
                             </w:r>
-                            <w:proofErr w:type="spellStart"/>
                             <w:r>
                               <w:rPr>
                                 <w:i/>
@@ -7080,16 +7177,7 @@
                                 <w:iCs/>
                                 <w:lang w:val="en-US"/>
                               </w:rPr>
-                              <w:t>egens</w:t>
-                            </w:r>
-                            <w:proofErr w:type="spellEnd"/>
-                            <w:r>
-                              <w:rPr>
-                                <w:i/>
-                                <w:iCs/>
-                                <w:lang w:val="en-US"/>
-                              </w:rPr>
-                              <w:t xml:space="preserve"> </w:t>
+                              <w:t xml:space="preserve">egens </w:t>
                             </w:r>
                             <w:r>
                               <w:rPr>
@@ -7097,19 +7185,11 @@
                               </w:rPr>
                               <w:t>(</w:t>
                             </w:r>
-                            <w:proofErr w:type="spellStart"/>
                             <w:r>
                               <w:rPr>
                                 <w:lang w:val="en-US"/>
                               </w:rPr>
-                              <w:t>mTourquoise</w:t>
-                            </w:r>
-                            <w:proofErr w:type="spellEnd"/>
-                            <w:r>
-                              <w:rPr>
-                                <w:lang w:val="en-US"/>
-                              </w:rPr>
-                              <w:t>-negative</w:t>
+                              <w:t>mTourquoise-negative</w:t>
                             </w:r>
                             <w:r>
                               <w:rPr>
@@ -7647,7 +7727,6 @@
                               </w:rPr>
                               <w:t xml:space="preserve">P. </w:t>
                             </w:r>
-                            <w:proofErr w:type="spellStart"/>
                             <w:r>
                               <w:rPr>
                                 <w:i/>
@@ -7656,7 +7735,6 @@
                               </w:rPr>
                               <w:t>grimontii</w:t>
                             </w:r>
-                            <w:proofErr w:type="spellEnd"/>
                             <w:r>
                               <w:rPr>
                                 <w:i/>
@@ -7909,7 +7987,6 @@
                               </w:rPr>
                               <w:t xml:space="preserve">P. </w:t>
                             </w:r>
-                            <w:proofErr w:type="spellStart"/>
                             <w:r>
                               <w:rPr>
                                 <w:i/>
@@ -7918,7 +7995,6 @@
                               </w:rPr>
                               <w:t>grimontii</w:t>
                             </w:r>
-                            <w:proofErr w:type="spellEnd"/>
                             <w:r>
                               <w:rPr>
                                 <w:i/>
@@ -8528,7 +8604,6 @@
                               </w:rPr>
                               <w:t xml:space="preserve">P. </w:t>
                             </w:r>
-                            <w:proofErr w:type="spellStart"/>
                             <w:r>
                               <w:rPr>
                                 <w:i/>
@@ -8537,7 +8612,6 @@
                               </w:rPr>
                               <w:t>veronii</w:t>
                             </w:r>
-                            <w:proofErr w:type="spellEnd"/>
                             <w:r>
                               <w:rPr>
                                 <w:i/>
@@ -8552,14 +8626,12 @@
                               </w:rPr>
                               <w:t>(</w:t>
                             </w:r>
-                            <w:proofErr w:type="spellStart"/>
                             <w:r>
                               <w:rPr>
                                 <w:lang w:val="en-US"/>
                               </w:rPr>
                               <w:t>mCherry</w:t>
                             </w:r>
-                            <w:proofErr w:type="spellEnd"/>
                             <w:r>
                               <w:rPr>
                                 <w:lang w:val="en-US"/>
@@ -8774,14 +8846,12 @@
                               </w:rPr>
                               <w:t xml:space="preserve">Gating strategy to identify the </w:t>
                             </w:r>
-                            <w:proofErr w:type="spellStart"/>
                             <w:r>
                               <w:rPr>
                                 <w:lang w:val="en-US"/>
                               </w:rPr>
                               <w:t>mCherry</w:t>
                             </w:r>
-                            <w:proofErr w:type="spellEnd"/>
                             <w:r>
                               <w:rPr>
                                 <w:lang w:val="en-US"/>
@@ -8796,7 +8866,6 @@
                               </w:rPr>
                               <w:t xml:space="preserve">P. </w:t>
                             </w:r>
-                            <w:proofErr w:type="spellStart"/>
                             <w:r>
                               <w:rPr>
                                 <w:i/>
@@ -8805,7 +8874,6 @@
                               </w:rPr>
                               <w:t>veronii</w:t>
                             </w:r>
-                            <w:proofErr w:type="spellEnd"/>
                             <w:r>
                               <w:rPr>
                                 <w:i/>
@@ -10311,6 +10379,9 @@
         </w:rPr>
       </w:pPr>
       <w:r>
+        <w:rPr>
+          <w:noProof/>
+        </w:rPr>
         <w:lastRenderedPageBreak/>
         <w:drawing>
           <wp:anchor distT="0" distB="0" distL="114300" distR="114300" simplePos="0" relativeHeight="251679744" behindDoc="1" locked="0" layoutInCell="1" allowOverlap="1" wp14:anchorId="1D1BA8DD" wp14:editId="12A46CEA">
@@ -10390,68 +10461,6 @@
           <w:lang w:val="en-US"/>
         </w:rPr>
       </w:pPr>
-      <w:r>
-        <w:rPr>
-          <w:rFonts w:ascii="Times New Roman" w:hAnsi="Times New Roman" w:cs="Times New Roman"/>
-          <w:noProof/>
-          <w:lang w:val="en-US"/>
-        </w:rPr>
-        <w:drawing>
-          <wp:anchor distT="0" distB="0" distL="114300" distR="114300" simplePos="0" relativeHeight="251682816" behindDoc="1" locked="0" layoutInCell="1" allowOverlap="1" wp14:anchorId="4CB65130" wp14:editId="17F1107F">
-            <wp:simplePos x="0" y="0"/>
-            <wp:positionH relativeFrom="margin">
-              <wp:align>left</wp:align>
-            </wp:positionH>
-            <wp:positionV relativeFrom="paragraph">
-              <wp:posOffset>4985385</wp:posOffset>
-            </wp:positionV>
-            <wp:extent cx="2811600" cy="2361600"/>
-            <wp:effectExtent l="0" t="0" r="8255" b="635"/>
-            <wp:wrapNone/>
-            <wp:docPr id="571197061" name="Picture 1" descr="A graph of different colored lines&#10;&#10;AI-generated content may be incorrect."/>
-            <wp:cNvGraphicFramePr>
-              <a:graphicFrameLocks xmlns:a="http://schemas.openxmlformats.org/drawingml/2006/main" noChangeAspect="1"/>
-            </wp:cNvGraphicFramePr>
-            <a:graphic xmlns:a="http://schemas.openxmlformats.org/drawingml/2006/main">
-              <a:graphicData uri="http://schemas.openxmlformats.org/drawingml/2006/picture">
-                <pic:pic xmlns:pic="http://schemas.openxmlformats.org/drawingml/2006/picture">
-                  <pic:nvPicPr>
-                    <pic:cNvPr id="571197061" name="Picture 1" descr="A graph of different colored lines&#10;&#10;AI-generated content may be incorrect."/>
-                    <pic:cNvPicPr/>
-                  </pic:nvPicPr>
-                  <pic:blipFill>
-                    <a:blip r:embed="rId19" cstate="print">
-                      <a:extLst>
-                        <a:ext uri="{28A0092B-C50C-407E-A947-70E740481C1C}">
-                          <a14:useLocalDpi xmlns:a14="http://schemas.microsoft.com/office/drawing/2010/main" val="0"/>
-                        </a:ext>
-                      </a:extLst>
-                    </a:blip>
-                    <a:stretch>
-                      <a:fillRect/>
-                    </a:stretch>
-                  </pic:blipFill>
-                  <pic:spPr>
-                    <a:xfrm>
-                      <a:off x="0" y="0"/>
-                      <a:ext cx="2811600" cy="2361600"/>
-                    </a:xfrm>
-                    <a:prstGeom prst="rect">
-                      <a:avLst/>
-                    </a:prstGeom>
-                  </pic:spPr>
-                </pic:pic>
-              </a:graphicData>
-            </a:graphic>
-            <wp14:sizeRelH relativeFrom="margin">
-              <wp14:pctWidth>0</wp14:pctWidth>
-            </wp14:sizeRelH>
-            <wp14:sizeRelV relativeFrom="margin">
-              <wp14:pctHeight>0</wp14:pctHeight>
-            </wp14:sizeRelV>
-          </wp:anchor>
-        </w:drawing>
-      </w:r>
     </w:p>
     <w:tbl>
       <w:tblPr>
@@ -10618,7 +10627,7 @@
                           <pic:cNvPicPr/>
                         </pic:nvPicPr>
                         <pic:blipFill>
-                          <a:blip r:embed="rId20" cstate="print">
+                          <a:blip r:embed="rId19" cstate="print">
                             <a:extLst>
                               <a:ext uri="{28A0092B-C50C-407E-A947-70E740481C1C}">
                                 <a14:useLocalDpi xmlns:a14="http://schemas.microsoft.com/office/drawing/2010/main" val="0"/>
@@ -10908,7 +10917,7 @@
                           <pic:cNvPicPr/>
                         </pic:nvPicPr>
                         <pic:blipFill>
-                          <a:blip r:embed="rId19" cstate="print">
+                          <a:blip r:embed="rId20" cstate="print">
                             <a:extLst>
                               <a:ext uri="{28A0092B-C50C-407E-A947-70E740481C1C}">
                                 <a14:useLocalDpi xmlns:a14="http://schemas.microsoft.com/office/drawing/2010/main" val="0"/>
@@ -10978,6 +10987,68 @@
       <w:r>
         <w:rPr>
           <w:rFonts w:ascii="Times New Roman" w:hAnsi="Times New Roman" w:cs="Times New Roman"/>
+          <w:noProof/>
+          <w:lang w:val="en-US"/>
+        </w:rPr>
+        <w:drawing>
+          <wp:anchor distT="0" distB="0" distL="114300" distR="114300" simplePos="0" relativeHeight="251682816" behindDoc="1" locked="0" layoutInCell="1" allowOverlap="1" wp14:anchorId="4CB65130" wp14:editId="30824760">
+            <wp:simplePos x="0" y="0"/>
+            <wp:positionH relativeFrom="margin">
+              <wp:align>left</wp:align>
+            </wp:positionH>
+            <wp:positionV relativeFrom="paragraph">
+              <wp:posOffset>2328</wp:posOffset>
+            </wp:positionV>
+            <wp:extent cx="3475146" cy="2489200"/>
+            <wp:effectExtent l="0" t="0" r="0" b="6350"/>
+            <wp:wrapNone/>
+            <wp:docPr id="571197061" name="Picture 1"/>
+            <wp:cNvGraphicFramePr>
+              <a:graphicFrameLocks xmlns:a="http://schemas.openxmlformats.org/drawingml/2006/main" noChangeAspect="1"/>
+            </wp:cNvGraphicFramePr>
+            <a:graphic xmlns:a="http://schemas.openxmlformats.org/drawingml/2006/main">
+              <a:graphicData uri="http://schemas.openxmlformats.org/drawingml/2006/picture">
+                <pic:pic xmlns:pic="http://schemas.openxmlformats.org/drawingml/2006/picture">
+                  <pic:nvPicPr>
+                    <pic:cNvPr id="571197061" name="Picture 1"/>
+                    <pic:cNvPicPr/>
+                  </pic:nvPicPr>
+                  <pic:blipFill>
+                    <a:blip r:embed="rId21" cstate="print">
+                      <a:extLst>
+                        <a:ext uri="{28A0092B-C50C-407E-A947-70E740481C1C}">
+                          <a14:useLocalDpi xmlns:a14="http://schemas.microsoft.com/office/drawing/2010/main" val="0"/>
+                        </a:ext>
+                      </a:extLst>
+                    </a:blip>
+                    <a:stretch>
+                      <a:fillRect/>
+                    </a:stretch>
+                  </pic:blipFill>
+                  <pic:spPr>
+                    <a:xfrm>
+                      <a:off x="0" y="0"/>
+                      <a:ext cx="3506439" cy="2511615"/>
+                    </a:xfrm>
+                    <a:prstGeom prst="rect">
+                      <a:avLst/>
+                    </a:prstGeom>
+                  </pic:spPr>
+                </pic:pic>
+              </a:graphicData>
+            </a:graphic>
+            <wp14:sizeRelH relativeFrom="margin">
+              <wp14:pctWidth>0</wp14:pctWidth>
+            </wp14:sizeRelH>
+            <wp14:sizeRelV relativeFrom="margin">
+              <wp14:pctHeight>0</wp14:pctHeight>
+            </wp14:sizeRelV>
+          </wp:anchor>
+        </w:drawing>
+      </w:r>
+      <w:r>
+        <w:rPr>
+          <w:rFonts w:ascii="Times New Roman" w:hAnsi="Times New Roman" w:cs="Times New Roman"/>
           <w:lang w:val="en-US"/>
         </w:rPr>
         <w:t>d)</w:t>
@@ -11562,7 +11633,23 @@
           <w:rFonts w:ascii="Times New Roman" w:hAnsi="Times New Roman" w:cs="Times New Roman"/>
           <w:lang w:val="en-US"/>
         </w:rPr>
-        <w:t>when those was incubated at lower temperatures. However, there was a complete absence of growth</w:t>
+        <w:t xml:space="preserve">when those </w:t>
+      </w:r>
+      <w:proofErr w:type="gramStart"/>
+      <w:r>
+        <w:rPr>
+          <w:rFonts w:ascii="Times New Roman" w:hAnsi="Times New Roman" w:cs="Times New Roman"/>
+          <w:lang w:val="en-US"/>
+        </w:rPr>
+        <w:t>was</w:t>
+      </w:r>
+      <w:proofErr w:type="gramEnd"/>
+      <w:r>
+        <w:rPr>
+          <w:rFonts w:ascii="Times New Roman" w:hAnsi="Times New Roman" w:cs="Times New Roman"/>
+          <w:lang w:val="en-US"/>
+        </w:rPr>
+        <w:t xml:space="preserve"> incubated at lower temperatures. However, there was a complete absence of growth</w:t>
       </w:r>
       <w:r>
         <w:rPr>
@@ -11678,7 +11765,7 @@
                           <pic:cNvPicPr/>
                         </pic:nvPicPr>
                         <pic:blipFill>
-                          <a:blip r:embed="rId21"/>
+                          <a:blip r:embed="rId22"/>
                           <a:stretch>
                             <a:fillRect/>
                           </a:stretch>
@@ -11748,7 +11835,7 @@
                           <pic:cNvPicPr/>
                         </pic:nvPicPr>
                         <pic:blipFill>
-                          <a:blip r:embed="rId22"/>
+                          <a:blip r:embed="rId23"/>
                           <a:stretch>
                             <a:fillRect/>
                           </a:stretch>
@@ -11820,7 +11907,7 @@
                           <pic:cNvPicPr/>
                         </pic:nvPicPr>
                         <pic:blipFill>
-                          <a:blip r:embed="rId23"/>
+                          <a:blip r:embed="rId24"/>
                           <a:stretch>
                             <a:fillRect/>
                           </a:stretch>
@@ -11890,7 +11977,7 @@
                           <pic:cNvPicPr/>
                         </pic:nvPicPr>
                         <pic:blipFill>
-                          <a:blip r:embed="rId24"/>
+                          <a:blip r:embed="rId25"/>
                           <a:stretch>
                             <a:fillRect/>
                           </a:stretch>
@@ -12199,7 +12286,23 @@
           <w:rFonts w:ascii="Times New Roman" w:hAnsi="Times New Roman" w:cs="Times New Roman"/>
           <w:lang w:val="en-US"/>
         </w:rPr>
-        <w:t xml:space="preserve">The horizontal dashed lines show the mean of the </w:t>
+        <w:t xml:space="preserve">The horizontal dashed lines show the </w:t>
+      </w:r>
+      <w:proofErr w:type="gramStart"/>
+      <w:r>
+        <w:rPr>
+          <w:rFonts w:ascii="Times New Roman" w:hAnsi="Times New Roman" w:cs="Times New Roman"/>
+          <w:lang w:val="en-US"/>
+        </w:rPr>
+        <w:t>mean</w:t>
+      </w:r>
+      <w:proofErr w:type="gramEnd"/>
+      <w:r>
+        <w:rPr>
+          <w:rFonts w:ascii="Times New Roman" w:hAnsi="Times New Roman" w:cs="Times New Roman"/>
+          <w:lang w:val="en-US"/>
+        </w:rPr>
+        <w:t xml:space="preserve"> of the </w:t>
       </w:r>
       <w:r>
         <w:rPr>
@@ -13093,7 +13196,27 @@
           <w:bCs/>
           <w:lang w:val="en-US"/>
         </w:rPr>
-        <w:t xml:space="preserve"> growth rate at ambient temperatures is correlated with that at extreme heat (</w:t>
+        <w:t xml:space="preserve"> growth rate at ambient temperatures </w:t>
+      </w:r>
+      <w:proofErr w:type="gramStart"/>
+      <w:r>
+        <w:rPr>
+          <w:rFonts w:ascii="Times New Roman" w:hAnsi="Times New Roman" w:cs="Times New Roman"/>
+          <w:b/>
+          <w:bCs/>
+          <w:lang w:val="en-US"/>
+        </w:rPr>
+        <w:t>is</w:t>
+      </w:r>
+      <w:proofErr w:type="gramEnd"/>
+      <w:r>
+        <w:rPr>
+          <w:rFonts w:ascii="Times New Roman" w:hAnsi="Times New Roman" w:cs="Times New Roman"/>
+          <w:b/>
+          <w:bCs/>
+          <w:lang w:val="en-US"/>
+        </w:rPr>
+        <w:t xml:space="preserve"> correlated with that at extreme heat (</w:t>
       </w:r>
       <w:r>
         <w:rPr>
@@ -13145,6 +13268,7 @@
               </w:rPr>
             </w:pPr>
             <w:proofErr w:type="spellStart"/>
+            <w:proofErr w:type="gramStart"/>
             <w:r>
               <w:rPr>
                 <w:rFonts w:ascii="Times New Roman" w:hAnsi="Times New Roman" w:cs="Times New Roman"/>
@@ -13165,7 +13289,15 @@
                 <w:rFonts w:ascii="Times New Roman" w:hAnsi="Times New Roman" w:cs="Times New Roman"/>
                 <w:lang w:val="en-US"/>
               </w:rPr>
-              <w:t>intrinsic growth rate at 40</w:t>
+              <w:t>intrinsic</w:t>
+            </w:r>
+            <w:proofErr w:type="gramEnd"/>
+            <w:r>
+              <w:rPr>
+                <w:rFonts w:ascii="Times New Roman" w:hAnsi="Times New Roman" w:cs="Times New Roman"/>
+                <w:lang w:val="en-US"/>
+              </w:rPr>
+              <w:t xml:space="preserve"> growth rate at 40</w:t>
             </w:r>
             <w:r>
               <w:rPr>
@@ -13193,7 +13325,15 @@
                 <w:rFonts w:ascii="Times New Roman" w:hAnsi="Times New Roman" w:cs="Times New Roman"/>
                 <w:lang w:val="en-US"/>
               </w:rPr>
-              <w:t xml:space="preserve"> + (1 | Species)</w:t>
+              <w:t xml:space="preserve"> + (1 | Species</w:t>
+            </w:r>
+            <w:proofErr w:type="gramStart"/>
+            <w:r>
+              <w:rPr>
+                <w:rFonts w:ascii="Times New Roman" w:hAnsi="Times New Roman" w:cs="Times New Roman"/>
+                <w:lang w:val="en-US"/>
+              </w:rPr>
+              <w:t>)</w:t>
             </w:r>
             <w:r>
               <w:rPr>
@@ -13202,6 +13342,7 @@
               </w:rPr>
               <w:t xml:space="preserve"> )</w:t>
             </w:r>
+            <w:proofErr w:type="gramEnd"/>
           </w:p>
         </w:tc>
       </w:tr>
@@ -13532,11 +13673,19 @@
               </w:rPr>
               <w:t>0.52</w:t>
             </w:r>
-            <w:r>
-              <w:rPr>
-                <w:rFonts w:ascii="Times New Roman" w:hAnsi="Times New Roman" w:cs="Times New Roman"/>
-              </w:rPr>
-              <w:t xml:space="preserve">   (NS)</w:t>
+            <w:proofErr w:type="gramStart"/>
+            <w:r>
+              <w:rPr>
+                <w:rFonts w:ascii="Times New Roman" w:hAnsi="Times New Roman" w:cs="Times New Roman"/>
+              </w:rPr>
+              <w:t xml:space="preserve">   (</w:t>
+            </w:r>
+            <w:proofErr w:type="gramEnd"/>
+            <w:r>
+              <w:rPr>
+                <w:rFonts w:ascii="Times New Roman" w:hAnsi="Times New Roman" w:cs="Times New Roman"/>
+              </w:rPr>
+              <w:t>NS)</w:t>
             </w:r>
           </w:p>
         </w:tc>
@@ -13659,11 +13808,19 @@
               </w:rPr>
               <w:t>0.63</w:t>
             </w:r>
-            <w:r>
-              <w:rPr>
-                <w:rFonts w:ascii="Times New Roman" w:hAnsi="Times New Roman" w:cs="Times New Roman"/>
-              </w:rPr>
-              <w:t xml:space="preserve">   (NS)</w:t>
+            <w:proofErr w:type="gramStart"/>
+            <w:r>
+              <w:rPr>
+                <w:rFonts w:ascii="Times New Roman" w:hAnsi="Times New Roman" w:cs="Times New Roman"/>
+              </w:rPr>
+              <w:t xml:space="preserve">   (</w:t>
+            </w:r>
+            <w:proofErr w:type="gramEnd"/>
+            <w:r>
+              <w:rPr>
+                <w:rFonts w:ascii="Times New Roman" w:hAnsi="Times New Roman" w:cs="Times New Roman"/>
+              </w:rPr>
+              <w:t>NS)</w:t>
             </w:r>
           </w:p>
         </w:tc>
@@ -13954,6 +14111,7 @@
               </w:rPr>
             </w:pPr>
             <w:proofErr w:type="spellStart"/>
+            <w:proofErr w:type="gramStart"/>
             <w:r>
               <w:rPr>
                 <w:rFonts w:ascii="Times New Roman" w:hAnsi="Times New Roman" w:cs="Times New Roman"/>
@@ -13967,7 +14125,15 @@
                 <w:rFonts w:ascii="Times New Roman" w:hAnsi="Times New Roman" w:cs="Times New Roman"/>
                 <w:lang w:val="en-US"/>
               </w:rPr>
-              <w:t>( intrinsic growth rate at 40</w:t>
+              <w:t>( intrinsic</w:t>
+            </w:r>
+            <w:proofErr w:type="gramEnd"/>
+            <w:r>
+              <w:rPr>
+                <w:rFonts w:ascii="Times New Roman" w:hAnsi="Times New Roman" w:cs="Times New Roman"/>
+                <w:lang w:val="en-US"/>
+              </w:rPr>
+              <w:t xml:space="preserve"> growth rate at 40</w:t>
             </w:r>
             <w:r>
               <w:rPr>
@@ -13995,8 +14161,17 @@
                 <w:rFonts w:ascii="Times New Roman" w:hAnsi="Times New Roman" w:cs="Times New Roman"/>
                 <w:lang w:val="en-US"/>
               </w:rPr>
-              <w:t xml:space="preserve"> + (1 | Species) )</w:t>
-            </w:r>
+              <w:t xml:space="preserve"> + (1 | Species</w:t>
+            </w:r>
+            <w:proofErr w:type="gramStart"/>
+            <w:r>
+              <w:rPr>
+                <w:rFonts w:ascii="Times New Roman" w:hAnsi="Times New Roman" w:cs="Times New Roman"/>
+                <w:lang w:val="en-US"/>
+              </w:rPr>
+              <w:t>) )</w:t>
+            </w:r>
+            <w:proofErr w:type="gramEnd"/>
           </w:p>
         </w:tc>
       </w:tr>
@@ -14400,11 +14575,19 @@
               </w:rPr>
               <w:t>0.28</w:t>
             </w:r>
-            <w:r>
-              <w:rPr>
-                <w:rFonts w:ascii="Times New Roman" w:hAnsi="Times New Roman" w:cs="Times New Roman"/>
-              </w:rPr>
-              <w:t xml:space="preserve">   (NS)</w:t>
+            <w:proofErr w:type="gramStart"/>
+            <w:r>
+              <w:rPr>
+                <w:rFonts w:ascii="Times New Roman" w:hAnsi="Times New Roman" w:cs="Times New Roman"/>
+              </w:rPr>
+              <w:t xml:space="preserve">   (</w:t>
+            </w:r>
+            <w:proofErr w:type="gramEnd"/>
+            <w:r>
+              <w:rPr>
+                <w:rFonts w:ascii="Times New Roman" w:hAnsi="Times New Roman" w:cs="Times New Roman"/>
+              </w:rPr>
+              <w:t>NS)</w:t>
             </w:r>
           </w:p>
         </w:tc>
@@ -14517,11 +14700,19 @@
               </w:rPr>
               <w:t>0.67</w:t>
             </w:r>
-            <w:r>
-              <w:rPr>
-                <w:rFonts w:ascii="Times New Roman" w:hAnsi="Times New Roman" w:cs="Times New Roman"/>
-              </w:rPr>
-              <w:t xml:space="preserve">   (NS)</w:t>
+            <w:proofErr w:type="gramStart"/>
+            <w:r>
+              <w:rPr>
+                <w:rFonts w:ascii="Times New Roman" w:hAnsi="Times New Roman" w:cs="Times New Roman"/>
+              </w:rPr>
+              <w:t xml:space="preserve">   (</w:t>
+            </w:r>
+            <w:proofErr w:type="gramEnd"/>
+            <w:r>
+              <w:rPr>
+                <w:rFonts w:ascii="Times New Roman" w:hAnsi="Times New Roman" w:cs="Times New Roman"/>
+              </w:rPr>
+              <w:t>NS)</w:t>
             </w:r>
           </w:p>
         </w:tc>
@@ -14855,6 +15046,7 @@
               </w:rPr>
             </w:pPr>
             <w:proofErr w:type="spellStart"/>
+            <w:proofErr w:type="gramStart"/>
             <w:r>
               <w:rPr>
                 <w:rFonts w:ascii="Times New Roman" w:hAnsi="Times New Roman" w:cs="Times New Roman"/>
@@ -14875,7 +15067,15 @@
                 <w:rFonts w:ascii="Times New Roman" w:hAnsi="Times New Roman" w:cs="Times New Roman"/>
                 <w:lang w:val="en-US"/>
               </w:rPr>
-              <w:t>relative growth by CFU</w:t>
+              <w:t>relative</w:t>
+            </w:r>
+            <w:proofErr w:type="gramEnd"/>
+            <w:r>
+              <w:rPr>
+                <w:rFonts w:ascii="Times New Roman" w:hAnsi="Times New Roman" w:cs="Times New Roman"/>
+                <w:lang w:val="en-US"/>
+              </w:rPr>
+              <w:t xml:space="preserve"> growth by CFU</w:t>
             </w:r>
             <w:r>
               <w:rPr>
@@ -14910,8 +15110,17 @@
                 <w:rFonts w:ascii="Times New Roman" w:hAnsi="Times New Roman" w:cs="Times New Roman"/>
                 <w:lang w:val="en-US"/>
               </w:rPr>
-              <w:t xml:space="preserve"> + (1 | Species) )</w:t>
-            </w:r>
+              <w:t xml:space="preserve"> + (1 | Species</w:t>
+            </w:r>
+            <w:proofErr w:type="gramStart"/>
+            <w:r>
+              <w:rPr>
+                <w:rFonts w:ascii="Times New Roman" w:hAnsi="Times New Roman" w:cs="Times New Roman"/>
+                <w:lang w:val="en-US"/>
+              </w:rPr>
+              <w:t>) )</w:t>
+            </w:r>
+            <w:proofErr w:type="gramEnd"/>
           </w:p>
         </w:tc>
       </w:tr>
@@ -15266,7 +15475,21 @@
               <w:rPr>
                 <w:rFonts w:ascii="Times New Roman" w:hAnsi="Times New Roman" w:cs="Times New Roman"/>
               </w:rPr>
-              <w:t xml:space="preserve">    (NS)</w:t>
+              <w:t xml:space="preserve"> </w:t>
+            </w:r>
+            <w:proofErr w:type="gramStart"/>
+            <w:r>
+              <w:rPr>
+                <w:rFonts w:ascii="Times New Roman" w:hAnsi="Times New Roman" w:cs="Times New Roman"/>
+              </w:rPr>
+              <w:t xml:space="preserve">   (</w:t>
+            </w:r>
+            <w:proofErr w:type="gramEnd"/>
+            <w:r>
+              <w:rPr>
+                <w:rFonts w:ascii="Times New Roman" w:hAnsi="Times New Roman" w:cs="Times New Roman"/>
+              </w:rPr>
+              <w:t>NS)</w:t>
             </w:r>
           </w:p>
         </w:tc>
@@ -15399,7 +15622,21 @@
               <w:rPr>
                 <w:rFonts w:ascii="Times New Roman" w:hAnsi="Times New Roman" w:cs="Times New Roman"/>
               </w:rPr>
-              <w:t xml:space="preserve">    (NS)</w:t>
+              <w:t xml:space="preserve"> </w:t>
+            </w:r>
+            <w:proofErr w:type="gramStart"/>
+            <w:r>
+              <w:rPr>
+                <w:rFonts w:ascii="Times New Roman" w:hAnsi="Times New Roman" w:cs="Times New Roman"/>
+              </w:rPr>
+              <w:t xml:space="preserve">   (</w:t>
+            </w:r>
+            <w:proofErr w:type="gramEnd"/>
+            <w:r>
+              <w:rPr>
+                <w:rFonts w:ascii="Times New Roman" w:hAnsi="Times New Roman" w:cs="Times New Roman"/>
+              </w:rPr>
+              <w:t>NS)</w:t>
             </w:r>
           </w:p>
         </w:tc>
@@ -15704,6 +15941,7 @@
               </w:rPr>
             </w:pPr>
             <w:proofErr w:type="spellStart"/>
+            <w:proofErr w:type="gramStart"/>
             <w:r>
               <w:rPr>
                 <w:rFonts w:ascii="Times New Roman" w:hAnsi="Times New Roman" w:cs="Times New Roman"/>
@@ -15724,7 +15962,15 @@
                 <w:rFonts w:ascii="Times New Roman" w:hAnsi="Times New Roman" w:cs="Times New Roman"/>
                 <w:lang w:val="en-US"/>
               </w:rPr>
-              <w:t xml:space="preserve"> relative growth by CFU </w:t>
+              <w:t xml:space="preserve"> relative</w:t>
+            </w:r>
+            <w:proofErr w:type="gramEnd"/>
+            <w:r>
+              <w:rPr>
+                <w:rFonts w:ascii="Times New Roman" w:hAnsi="Times New Roman" w:cs="Times New Roman"/>
+                <w:lang w:val="en-US"/>
+              </w:rPr>
+              <w:t xml:space="preserve"> growth by CFU </w:t>
             </w:r>
             <w:r>
               <w:rPr>
@@ -15759,8 +16005,17 @@
                 <w:rFonts w:ascii="Times New Roman" w:hAnsi="Times New Roman" w:cs="Times New Roman"/>
                 <w:lang w:val="en-US"/>
               </w:rPr>
-              <w:t xml:space="preserve"> + (1 | Species) )</w:t>
-            </w:r>
+              <w:t xml:space="preserve"> + (1 | Species</w:t>
+            </w:r>
+            <w:proofErr w:type="gramStart"/>
+            <w:r>
+              <w:rPr>
+                <w:rFonts w:ascii="Times New Roman" w:hAnsi="Times New Roman" w:cs="Times New Roman"/>
+                <w:lang w:val="en-US"/>
+              </w:rPr>
+              <w:t>) )</w:t>
+            </w:r>
+            <w:proofErr w:type="gramEnd"/>
           </w:p>
         </w:tc>
       </w:tr>
@@ -16188,7 +16443,21 @@
               <w:rPr>
                 <w:rFonts w:ascii="Times New Roman" w:hAnsi="Times New Roman" w:cs="Times New Roman"/>
               </w:rPr>
-              <w:t>4     (NS)</w:t>
+              <w:t xml:space="preserve">4  </w:t>
+            </w:r>
+            <w:proofErr w:type="gramStart"/>
+            <w:r>
+              <w:rPr>
+                <w:rFonts w:ascii="Times New Roman" w:hAnsi="Times New Roman" w:cs="Times New Roman"/>
+              </w:rPr>
+              <w:t xml:space="preserve">   (</w:t>
+            </w:r>
+            <w:proofErr w:type="gramEnd"/>
+            <w:r>
+              <w:rPr>
+                <w:rFonts w:ascii="Times New Roman" w:hAnsi="Times New Roman" w:cs="Times New Roman"/>
+              </w:rPr>
+              <w:t>NS)</w:t>
             </w:r>
           </w:p>
         </w:tc>
@@ -16326,7 +16595,21 @@
               <w:rPr>
                 <w:rFonts w:ascii="Times New Roman" w:hAnsi="Times New Roman" w:cs="Times New Roman"/>
               </w:rPr>
-              <w:t>048   (NS)</w:t>
+              <w:t>048</w:t>
+            </w:r>
+            <w:proofErr w:type="gramStart"/>
+            <w:r>
+              <w:rPr>
+                <w:rFonts w:ascii="Times New Roman" w:hAnsi="Times New Roman" w:cs="Times New Roman"/>
+              </w:rPr>
+              <w:t xml:space="preserve">   (</w:t>
+            </w:r>
+            <w:proofErr w:type="gramEnd"/>
+            <w:r>
+              <w:rPr>
+                <w:rFonts w:ascii="Times New Roman" w:hAnsi="Times New Roman" w:cs="Times New Roman"/>
+              </w:rPr>
+              <w:t>NS)</w:t>
             </w:r>
           </w:p>
         </w:tc>
@@ -16600,7 +16883,7 @@
                     <pic:cNvPicPr/>
                   </pic:nvPicPr>
                   <pic:blipFill>
-                    <a:blip r:embed="rId25"/>
+                    <a:blip r:embed="rId26"/>
                     <a:stretch>
                       <a:fillRect/>
                     </a:stretch>
@@ -16706,7 +16989,23 @@
           <w:rFonts w:ascii="Times New Roman" w:hAnsi="Times New Roman" w:cs="Times New Roman"/>
           <w:lang w:val="en-US"/>
         </w:rPr>
-        <w:t xml:space="preserve"> Three dimensions were used for the analysis as the this is dimensionality is readily interpretable and the decrease in stress plateaus off around k=3.</w:t>
+        <w:t xml:space="preserve"> Three dimensions were used for the analysis as </w:t>
+      </w:r>
+      <w:proofErr w:type="gramStart"/>
+      <w:r>
+        <w:rPr>
+          <w:rFonts w:ascii="Times New Roman" w:hAnsi="Times New Roman" w:cs="Times New Roman"/>
+          <w:lang w:val="en-US"/>
+        </w:rPr>
+        <w:t>the this is</w:t>
+      </w:r>
+      <w:proofErr w:type="gramEnd"/>
+      <w:r>
+        <w:rPr>
+          <w:rFonts w:ascii="Times New Roman" w:hAnsi="Times New Roman" w:cs="Times New Roman"/>
+          <w:lang w:val="en-US"/>
+        </w:rPr>
+        <w:t xml:space="preserve"> dimensionality is readily interpretable and the decrease in stress plateaus off around k=3.</w:t>
       </w:r>
     </w:p>
     <w:p>
@@ -16766,7 +17065,7 @@
                     <pic:cNvPicPr/>
                   </pic:nvPicPr>
                   <pic:blipFill>
-                    <a:blip r:embed="rId26" cstate="print">
+                    <a:blip r:embed="rId27" cstate="print">
                       <a:extLst>
                         <a:ext uri="{28A0092B-C50C-407E-A947-70E740481C1C}">
                           <a14:useLocalDpi xmlns:a14="http://schemas.microsoft.com/office/drawing/2010/main" val="0"/>
@@ -16917,7 +17216,23 @@
           <w:rFonts w:ascii="Times New Roman" w:hAnsi="Times New Roman" w:cs="Times New Roman"/>
           <w:lang w:val="en-US"/>
         </w:rPr>
-        <w:t xml:space="preserve"> is grown alone versus when </w:t>
+        <w:t xml:space="preserve"> </w:t>
+      </w:r>
+      <w:proofErr w:type="gramStart"/>
+      <w:r>
+        <w:rPr>
+          <w:rFonts w:ascii="Times New Roman" w:hAnsi="Times New Roman" w:cs="Times New Roman"/>
+          <w:lang w:val="en-US"/>
+        </w:rPr>
+        <w:t>is</w:t>
+      </w:r>
+      <w:proofErr w:type="gramEnd"/>
+      <w:r>
+        <w:rPr>
+          <w:rFonts w:ascii="Times New Roman" w:hAnsi="Times New Roman" w:cs="Times New Roman"/>
+          <w:lang w:val="en-US"/>
+        </w:rPr>
+        <w:t xml:space="preserve"> grown alone versus when </w:t>
       </w:r>
       <w:r>
         <w:rPr>
@@ -16944,7 +17259,23 @@
           <w:rFonts w:ascii="Times New Roman" w:hAnsi="Times New Roman" w:cs="Times New Roman"/>
           <w:lang w:val="en-US"/>
         </w:rPr>
-        <w:t xml:space="preserve"> is grown with another species. </w:t>
+        <w:t xml:space="preserve"> </w:t>
+      </w:r>
+      <w:proofErr w:type="gramStart"/>
+      <w:r>
+        <w:rPr>
+          <w:rFonts w:ascii="Times New Roman" w:hAnsi="Times New Roman" w:cs="Times New Roman"/>
+          <w:lang w:val="en-US"/>
+        </w:rPr>
+        <w:t>is</w:t>
+      </w:r>
+      <w:proofErr w:type="gramEnd"/>
+      <w:r>
+        <w:rPr>
+          <w:rFonts w:ascii="Times New Roman" w:hAnsi="Times New Roman" w:cs="Times New Roman"/>
+          <w:lang w:val="en-US"/>
+        </w:rPr>
+        <w:t xml:space="preserve"> grown with another species. </w:t>
       </w:r>
     </w:p>
     <w:p>
@@ -16980,7 +17311,7 @@
                     </pic:cNvPicPr>
                   </pic:nvPicPr>
                   <pic:blipFill>
-                    <a:blip r:embed="rId27">
+                    <a:blip r:embed="rId28">
                       <a:extLst>
                         <a:ext uri="{28A0092B-C50C-407E-A947-70E740481C1C}">
                           <a14:useLocalDpi xmlns:a14="http://schemas.microsoft.com/office/drawing/2010/main" val="0"/>
@@ -17201,7 +17532,7 @@
                     <pic:cNvPicPr/>
                   </pic:nvPicPr>
                   <pic:blipFill>
-                    <a:blip r:embed="rId28"/>
+                    <a:blip r:embed="rId29"/>
                     <a:stretch>
                       <a:fillRect/>
                     </a:stretch>
@@ -17318,7 +17649,23 @@
           <w:rFonts w:ascii="Times New Roman" w:hAnsi="Times New Roman" w:cs="Times New Roman"/>
           <w:lang w:val="en-US"/>
         </w:rPr>
-        <w:t xml:space="preserve"> show the community expected growth rates, and the facets show communities without (left) and with (right) </w:t>
+        <w:t xml:space="preserve"> show the </w:t>
+      </w:r>
+      <w:proofErr w:type="gramStart"/>
+      <w:r>
+        <w:rPr>
+          <w:rFonts w:ascii="Times New Roman" w:hAnsi="Times New Roman" w:cs="Times New Roman"/>
+          <w:lang w:val="en-US"/>
+        </w:rPr>
+        <w:t>community</w:t>
+      </w:r>
+      <w:proofErr w:type="gramEnd"/>
+      <w:r>
+        <w:rPr>
+          <w:rFonts w:ascii="Times New Roman" w:hAnsi="Times New Roman" w:cs="Times New Roman"/>
+          <w:lang w:val="en-US"/>
+        </w:rPr>
+        <w:t xml:space="preserve"> expected growth rates, and the facets show communities without (left) and with (right) </w:t>
       </w:r>
       <w:r>
         <w:rPr>
@@ -17388,7 +17735,7 @@
                     <pic:cNvPicPr/>
                   </pic:nvPicPr>
                   <pic:blipFill>
-                    <a:blip r:embed="rId29"/>
+                    <a:blip r:embed="rId30"/>
                     <a:stretch>
                       <a:fillRect/>
                     </a:stretch>
@@ -22866,7 +23213,7 @@
                     <pic:cNvPicPr/>
                   </pic:nvPicPr>
                   <pic:blipFill>
-                    <a:blip r:embed="rId30"/>
+                    <a:blip r:embed="rId31"/>
                     <a:stretch>
                       <a:fillRect/>
                     </a:stretch>
@@ -28418,7 +28765,7 @@
                     <pic:cNvPicPr/>
                   </pic:nvPicPr>
                   <pic:blipFill>
-                    <a:blip r:embed="rId31"/>
+                    <a:blip r:embed="rId32"/>
                     <a:stretch>
                       <a:fillRect/>
                     </a:stretch>
@@ -28469,7 +28816,7 @@
                     <pic:cNvPicPr/>
                   </pic:nvPicPr>
                   <pic:blipFill>
-                    <a:blip r:embed="rId32"/>
+                    <a:blip r:embed="rId33"/>
                     <a:stretch>
                       <a:fillRect/>
                     </a:stretch>
@@ -28523,7 +28870,27 @@
           <w:bCs/>
           <w:lang w:val="en-US"/>
         </w:rPr>
-        <w:t>. Decoupling plot of the effect sizes on productivity for the completely data (i.e., including communities that went extinct).</w:t>
+        <w:t xml:space="preserve">. Decoupling plot of the effect sizes on productivity for the </w:t>
+      </w:r>
+      <w:proofErr w:type="gramStart"/>
+      <w:r>
+        <w:rPr>
+          <w:rFonts w:ascii="Times New Roman" w:hAnsi="Times New Roman" w:cs="Times New Roman"/>
+          <w:b/>
+          <w:bCs/>
+          <w:lang w:val="en-US"/>
+        </w:rPr>
+        <w:t>completely</w:t>
+      </w:r>
+      <w:proofErr w:type="gramEnd"/>
+      <w:r>
+        <w:rPr>
+          <w:rFonts w:ascii="Times New Roman" w:hAnsi="Times New Roman" w:cs="Times New Roman"/>
+          <w:b/>
+          <w:bCs/>
+          <w:lang w:val="en-US"/>
+        </w:rPr>
+        <w:t xml:space="preserve"> data (i.e., including communities that went extinct).</w:t>
       </w:r>
       <w:r>
         <w:rPr>
@@ -29146,6 +29513,7 @@
   <w:style w:type="character" w:default="1" w:styleId="DefaultParagraphFont">
     <w:name w:val="Default Paragraph Font"/>
     <w:uiPriority w:val="1"/>
+    <w:semiHidden/>
     <w:unhideWhenUsed/>
   </w:style>
   <w:style w:type="table" w:default="1" w:styleId="TableNormal">

</xml_diff>